<commit_message>
lb4 done + lb3 update
</commit_message>
<xml_diff>
--- a/Fedorov_Kirill/lb3/Отчёт_ЛР3.docx
+++ b/Fedorov_Kirill/lb3/Отчёт_ЛР3.docx
@@ -874,7 +874,13 @@
           <w:highlight w:val="white"/>
         </w:rPr>
         <w:tab/>
-        <w:t>Изучить метод хорд для решения нелинейных уравнений. Найти корень заданного уравнения с заданной точностью, исследовать зависимость количества итераций от требуемой точности  и оценить устойчивость метода к ошибкам в исходных данных.</w:t>
+      </w:r>
+      <w:r>
+        <w:rPr>
+          <w:szCs w:val="28"/>
+          <w:highlight w:val="white"/>
+        </w:rPr>
+        <w:t>Изучить метод Ньютона (касательных) для численного решения нелинейных уравнений, программно реализовать алгоритм на языке C++, а также исследовать его квадратичную скорость сходимости и чувствительность к вычислительным погрешностям в исходных функциях f(x) и f′(x).</w:t>
       </w:r>
     </w:p>
     <w:p>
@@ -928,10 +934,10 @@
             <v:path o:extrusionok="f" gradientshapeok="t" o:connecttype="rect"/>
             <o:lock v:ext="edit" aspectratio="t"/>
           </v:shapetype>
-          <v:shape id="_x0000_i1025" type="#_x0000_t75" style="width:45.35pt;height:16.65pt" o:ole="">
+          <v:shape id="_x0000_i1025" type="#_x0000_t75" style="width:45.6pt;height:16.8pt" o:ole="">
             <v:imagedata r:id="rId7" o:title=""/>
           </v:shape>
-          <o:OLEObject Type="Embed" ProgID="Equation.2" ShapeID="_x0000_i1025" DrawAspect="Content" ObjectID="_1836223991" r:id="rId8"/>
+          <o:OLEObject Type="Embed" ProgID="Equation.2" ShapeID="_x0000_i1025" DrawAspect="Content" ObjectID="_1836226706" r:id="rId8"/>
         </w:object>
       </w:r>
       <w:r>
@@ -946,10 +952,10 @@
           <w:szCs w:val="28"/>
         </w:rPr>
         <w:object w:dxaOrig="2640" w:dyaOrig="320" w14:anchorId="5181DF65">
-          <v:shape id="_x0000_i1026" type="#_x0000_t75" style="width:132pt;height:16pt" o:ole="">
+          <v:shape id="_x0000_i1026" type="#_x0000_t75" style="width:132pt;height:16.2pt" o:ole="">
             <v:imagedata r:id="rId9" o:title=""/>
           </v:shape>
-          <o:OLEObject Type="Embed" ProgID="Equation.2" ShapeID="_x0000_i1026" DrawAspect="Content" ObjectID="_1836223992" r:id="rId10"/>
+          <o:OLEObject Type="Embed" ProgID="Equation.2" ShapeID="_x0000_i1026" DrawAspect="Content" ObjectID="_1836226707" r:id="rId10"/>
         </w:object>
       </w:r>
       <w:r>
@@ -964,10 +970,10 @@
           <w:szCs w:val="28"/>
         </w:rPr>
         <w:object w:dxaOrig="900" w:dyaOrig="340" w14:anchorId="7E63FE2E">
-          <v:shape id="_x0000_i1027" type="#_x0000_t75" style="width:45.35pt;height:16.65pt" o:ole="">
+          <v:shape id="_x0000_i1027" type="#_x0000_t75" style="width:45.6pt;height:16.8pt" o:ole="">
             <v:imagedata r:id="rId7" o:title=""/>
           </v:shape>
-          <o:OLEObject Type="Embed" ProgID="Equation.2" ShapeID="_x0000_i1027" DrawAspect="Content" ObjectID="_1836223993" r:id="rId11"/>
+          <o:OLEObject Type="Embed" ProgID="Equation.2" ShapeID="_x0000_i1027" DrawAspect="Content" ObjectID="_1836226708" r:id="rId11"/>
         </w:object>
       </w:r>
       <w:r>
@@ -988,10 +994,10 @@
           <w:szCs w:val="28"/>
         </w:rPr>
         <w:object w:dxaOrig="4973" w:dyaOrig="3609" w14:anchorId="094F506B">
-          <v:shape id="_x0000_i1028" type="#_x0000_t75" style="width:304pt;height:204.65pt" o:ole="">
+          <v:shape id="_x0000_i1028" type="#_x0000_t75" style="width:304.2pt;height:204.6pt" o:ole="">
             <v:imagedata r:id="rId12" o:title=""/>
           </v:shape>
-          <o:OLEObject Type="Embed" ProgID="Word.Document.8" ShapeID="_x0000_i1028" DrawAspect="Content" ObjectID="_1836223994" r:id="rId13"/>
+          <o:OLEObject Type="Embed" ProgID="Word.Document.8" ShapeID="_x0000_i1028" DrawAspect="Content" ObjectID="_1836226709" r:id="rId13"/>
         </w:object>
       </w:r>
     </w:p>
@@ -1013,10 +1019,10 @@
           <w:szCs w:val="28"/>
         </w:rPr>
         <w:object w:dxaOrig="1140" w:dyaOrig="320" w14:anchorId="6727FB3D">
-          <v:shape id="_x0000_i1029" type="#_x0000_t75" style="width:57.35pt;height:16pt" o:ole="">
+          <v:shape id="_x0000_i1029" type="#_x0000_t75" style="width:57.6pt;height:16.2pt" o:ole="">
             <v:imagedata r:id="rId14" o:title=""/>
           </v:shape>
-          <o:OLEObject Type="Embed" ProgID="Equation.2" ShapeID="_x0000_i1029" DrawAspect="Content" ObjectID="_1836223995" r:id="rId15"/>
+          <o:OLEObject Type="Embed" ProgID="Equation.2" ShapeID="_x0000_i1029" DrawAspect="Content" ObjectID="_1836226710" r:id="rId15"/>
         </w:object>
       </w:r>
       <w:r>
@@ -1059,10 +1065,10 @@
           <w:szCs w:val="28"/>
         </w:rPr>
         <w:object w:dxaOrig="900" w:dyaOrig="340" w14:anchorId="03DE53BE">
-          <v:shape id="_x0000_i1030" type="#_x0000_t75" style="width:45.35pt;height:16.65pt" o:ole="">
+          <v:shape id="_x0000_i1030" type="#_x0000_t75" style="width:45.6pt;height:16.8pt" o:ole="">
             <v:imagedata r:id="rId7" o:title=""/>
           </v:shape>
-          <o:OLEObject Type="Embed" ProgID="Equation.2" ShapeID="_x0000_i1030" DrawAspect="Content" ObjectID="_1836223996" r:id="rId16"/>
+          <o:OLEObject Type="Embed" ProgID="Equation.2" ShapeID="_x0000_i1030" DrawAspect="Content" ObjectID="_1836226711" r:id="rId16"/>
         </w:object>
       </w:r>
       <w:r>
@@ -1110,10 +1116,10 @@
           <w:szCs w:val="28"/>
         </w:rPr>
         <w:object w:dxaOrig="2500" w:dyaOrig="680" w14:anchorId="70D30DF8">
-          <v:shape id="_x0000_i1031" type="#_x0000_t75" style="width:124.65pt;height:34pt" o:ole="">
+          <v:shape id="_x0000_i1031" type="#_x0000_t75" style="width:124.8pt;height:34.2pt" o:ole="">
             <v:imagedata r:id="rId17" o:title=""/>
           </v:shape>
-          <o:OLEObject Type="Embed" ProgID="Equation.2" ShapeID="_x0000_i1031" DrawAspect="Content" ObjectID="_1836223997" r:id="rId18"/>
+          <o:OLEObject Type="Embed" ProgID="Equation.2" ShapeID="_x0000_i1031" DrawAspect="Content" ObjectID="_1836226712" r:id="rId18"/>
         </w:object>
       </w:r>
     </w:p>
@@ -1149,10 +1155,10 @@
           <w:szCs w:val="28"/>
         </w:rPr>
         <w:object w:dxaOrig="740" w:dyaOrig="400" w14:anchorId="6BCBC9F8">
-          <v:shape id="_x0000_i1032" type="#_x0000_t75" style="width:37.35pt;height:20pt" o:ole="">
+          <v:shape id="_x0000_i1032" type="#_x0000_t75" style="width:37.2pt;height:19.8pt" o:ole="">
             <v:imagedata r:id="rId19" o:title=""/>
           </v:shape>
-          <o:OLEObject Type="Embed" ProgID="Equation.2" ShapeID="_x0000_i1032" DrawAspect="Content" ObjectID="_1836223998" r:id="rId20"/>
+          <o:OLEObject Type="Embed" ProgID="Equation.2" ShapeID="_x0000_i1032" DrawAspect="Content" ObjectID="_1836226713" r:id="rId20"/>
         </w:object>
       </w:r>
       <w:r>
@@ -1213,10 +1219,10 @@
           <w:szCs w:val="28"/>
         </w:rPr>
         <w:object w:dxaOrig="700" w:dyaOrig="400" w14:anchorId="04101813">
-          <v:shape id="_x0000_i1033" type="#_x0000_t75" style="width:34.65pt;height:20pt" o:ole="">
+          <v:shape id="_x0000_i1033" type="#_x0000_t75" style="width:34.8pt;height:19.8pt" o:ole="">
             <v:imagedata r:id="rId21" o:title=""/>
           </v:shape>
-          <o:OLEObject Type="Embed" ProgID="Equation.2" ShapeID="_x0000_i1033" DrawAspect="Content" ObjectID="_1836223999" r:id="rId22"/>
+          <o:OLEObject Type="Embed" ProgID="Equation.2" ShapeID="_x0000_i1033" DrawAspect="Content" ObjectID="_1836226714" r:id="rId22"/>
         </w:object>
       </w:r>
       <w:r>
@@ -1257,10 +1263,10 @@
           <w:szCs w:val="28"/>
         </w:rPr>
         <w:object w:dxaOrig="1400" w:dyaOrig="420" w14:anchorId="78783072">
-          <v:shape id="_x0000_i1034" type="#_x0000_t75" style="width:70pt;height:21.35pt" o:ole="">
+          <v:shape id="_x0000_i1034" type="#_x0000_t75" style="width:70.2pt;height:21.6pt" o:ole="">
             <v:imagedata r:id="rId23" o:title=""/>
           </v:shape>
-          <o:OLEObject Type="Embed" ProgID="Equation.2" ShapeID="_x0000_i1034" DrawAspect="Content" ObjectID="_1836224000" r:id="rId24"/>
+          <o:OLEObject Type="Embed" ProgID="Equation.2" ShapeID="_x0000_i1034" DrawAspect="Content" ObjectID="_1836226715" r:id="rId24"/>
         </w:object>
       </w:r>
       <w:r>
@@ -1275,10 +1281,10 @@
           <w:szCs w:val="28"/>
         </w:rPr>
         <w:object w:dxaOrig="1660" w:dyaOrig="720" w14:anchorId="35E77150">
-          <v:shape id="_x0000_i1035" type="#_x0000_t75" style="width:82.65pt;height:36pt" o:ole="">
+          <v:shape id="_x0000_i1035" type="#_x0000_t75" style="width:82.8pt;height:36pt" o:ole="">
             <v:imagedata r:id="rId25" o:title=""/>
           </v:shape>
-          <o:OLEObject Type="Embed" ProgID="Equation.2" ShapeID="_x0000_i1035" DrawAspect="Content" ObjectID="_1836224001" r:id="rId26"/>
+          <o:OLEObject Type="Embed" ProgID="Equation.2" ShapeID="_x0000_i1035" DrawAspect="Content" ObjectID="_1836226716" r:id="rId26"/>
         </w:object>
       </w:r>
       <w:r>
@@ -1312,10 +1318,10 @@
           <w:szCs w:val="28"/>
         </w:rPr>
         <w:object w:dxaOrig="2940" w:dyaOrig="420" w14:anchorId="0AF2D31F">
-          <v:shape id="_x0000_i1036" type="#_x0000_t75" style="width:147.35pt;height:21.35pt" o:ole="">
+          <v:shape id="_x0000_i1036" type="#_x0000_t75" style="width:147pt;height:21.6pt" o:ole="">
             <v:imagedata r:id="rId27" o:title=""/>
           </v:shape>
-          <o:OLEObject Type="Embed" ProgID="Equation.2" ShapeID="_x0000_i1036" DrawAspect="Content" ObjectID="_1836224002" r:id="rId28"/>
+          <o:OLEObject Type="Embed" ProgID="Equation.2" ShapeID="_x0000_i1036" DrawAspect="Content" ObjectID="_1836226717" r:id="rId28"/>
         </w:object>
       </w:r>
       <w:r>
@@ -1397,10 +1403,10 @@
           <w:szCs w:val="28"/>
         </w:rPr>
         <w:object w:dxaOrig="1680" w:dyaOrig="320" w14:anchorId="209A0390">
-          <v:shape id="_x0000_i1037" type="#_x0000_t75" style="width:84pt;height:16pt" o:ole="">
+          <v:shape id="_x0000_i1037" type="#_x0000_t75" style="width:84pt;height:16.2pt" o:ole="">
             <v:imagedata r:id="rId29" o:title=""/>
           </v:shape>
-          <o:OLEObject Type="Embed" ProgID="Equation.2" ShapeID="_x0000_i1037" DrawAspect="Content" ObjectID="_1836224003" r:id="rId30"/>
+          <o:OLEObject Type="Embed" ProgID="Equation.2" ShapeID="_x0000_i1037" DrawAspect="Content" ObjectID="_1836226718" r:id="rId30"/>
         </w:object>
       </w:r>
       <w:r>
@@ -1415,10 +1421,10 @@
           <w:szCs w:val="28"/>
         </w:rPr>
         <w:object w:dxaOrig="2920" w:dyaOrig="320" w14:anchorId="4F8760BC">
-          <v:shape id="_x0000_i1038" type="#_x0000_t75" style="width:146pt;height:16pt" o:ole="">
+          <v:shape id="_x0000_i1038" type="#_x0000_t75" style="width:145.8pt;height:16.2pt" o:ole="">
             <v:imagedata r:id="rId31" o:title=""/>
           </v:shape>
-          <o:OLEObject Type="Embed" ProgID="Equation.2" ShapeID="_x0000_i1038" DrawAspect="Content" ObjectID="_1836224004" r:id="rId32"/>
+          <o:OLEObject Type="Embed" ProgID="Equation.2" ShapeID="_x0000_i1038" DrawAspect="Content" ObjectID="_1836226719" r:id="rId32"/>
         </w:object>
       </w:r>
       <w:r>
@@ -2119,7 +2125,6 @@
           <w:rPr>
             <w:rFonts w:ascii="Cambria Math" w:hAnsi="Cambria Math"/>
             <w:szCs w:val="28"/>
-            <w:lang w:val="en-US"/>
           </w:rPr>
           <m:t>(2</m:t>
         </m:r>
@@ -2144,7 +2149,28 @@
                 <w:szCs w:val="28"/>
                 <w:lang w:val="en-US"/>
               </w:rPr>
-              <m:t>x*ln</m:t>
+              <m:t>x</m:t>
+            </m:r>
+            <m:r>
+              <m:rPr>
+                <m:sty m:val="p"/>
+              </m:rPr>
+              <w:rPr>
+                <w:rFonts w:ascii="Cambria Math" w:hAnsi="Cambria Math"/>
+                <w:szCs w:val="28"/>
+              </w:rPr>
+              <m:t>*</m:t>
+            </m:r>
+            <m:r>
+              <m:rPr>
+                <m:sty m:val="p"/>
+              </m:rPr>
+              <w:rPr>
+                <w:rFonts w:ascii="Cambria Math" w:hAnsi="Cambria Math"/>
+                <w:szCs w:val="28"/>
+                <w:lang w:val="en-US"/>
+              </w:rPr>
+              <m:t>ln</m:t>
             </m:r>
           </m:fName>
           <m:e>
@@ -2177,7 +2203,6 @@
           <w:rPr>
             <w:rFonts w:ascii="Cambria Math" w:hAnsi="Cambria Math"/>
             <w:szCs w:val="28"/>
-            <w:lang w:val="en-US"/>
           </w:rPr>
           <m:t xml:space="preserve">+1)/ </m:t>
         </m:r>
@@ -2225,9 +2250,6 @@
         <w:t>Вторая производная:</w:t>
       </w:r>
       <w:r>
-        <w:rPr>
-          <w:lang w:val="en-US"/>
-        </w:rPr>
         <w:t xml:space="preserve"> </w:t>
       </w:r>
       <m:oMath>
@@ -3110,7 +3132,6 @@
         <w:rPr>
           <w:iCs/>
           <w:szCs w:val="28"/>
-          <w:lang w:val="en-US"/>
         </w:rPr>
       </w:pPr>
       <w:r>
@@ -3318,7 +3339,6 @@
         <w:rPr>
           <w:iCs/>
           <w:szCs w:val="28"/>
-          <w:lang w:val="en-US"/>
         </w:rPr>
         <w:t>;</w:t>
       </w:r>
@@ -6974,7 +6994,6 @@
       <w:r>
         <w:rPr>
           <w:szCs w:val="28"/>
-          <w:lang w:val="en-US"/>
         </w:rPr>
         <w:t>3</w:t>
       </w:r>
@@ -10141,7 +10160,6 @@
         <w:pStyle w:val="a7"/>
         <w:rPr>
           <w:color w:val="auto"/>
-          <w:lang w:val="en-US"/>
         </w:rPr>
       </w:pPr>
       <w:r>
@@ -10154,7 +10172,6 @@
       <w:r>
         <w:rPr>
           <w:color w:val="auto"/>
-          <w:lang w:val="en-US"/>
         </w:rPr>
         <w:t xml:space="preserve"> </w:t>
       </w:r>
@@ -10168,7 +10185,6 @@
       <w:r>
         <w:rPr>
           <w:color w:val="auto"/>
-          <w:lang w:val="en-US"/>
         </w:rPr>
         <w:t xml:space="preserve"> </w:t>
       </w:r>
@@ -10182,7 +10198,6 @@
       <w:r>
         <w:rPr>
           <w:color w:val="auto"/>
-          <w:lang w:val="en-US"/>
         </w:rPr>
         <w:t>(</w:t>
       </w:r>
@@ -10196,7 +10211,6 @@
       <w:r>
         <w:rPr>
           <w:color w:val="auto"/>
-          <w:lang w:val="en-US"/>
         </w:rPr>
         <w:t>);</w:t>
       </w:r>

</xml_diff>